<commit_message>
docs: ordenar las propiedades de tabla según el esquema de Word
Las tablas tenían propiedades en un orden que el esquema OOXML no admite.
LibreOffice lo tolera, pero Word puede reportar contenido ilegible. Los
ocho documentos de la Fase 2 pasan ahora la validación del esquema.

Co-Authored-By: Claude Opus 5.5 <noreply@anthropic.com>
Claude-Session: https://claude.ai/code/session_019yAiQ6SJ8faHeryAa6w9Vi
</commit_message>
<xml_diff>
--- a/Fase 2/Evidencias Proyecto (version Agil)/Documento 02- Product Backlog.docx
+++ b/Fase 2/Evidencias Proyecto (version Agil)/Documento 02- Product Backlog.docx
@@ -12316,10 +12316,9 @@
     <w:tbl>
       <w:tblPr>
         <w:tblStyle w:val="Tablaconcuadrcula1clara-nfasis1"/>
+        <w:tblW w:w="9072" w:type="dxa"/>
         <w:tblLayout w:type="fixed"/>
         <w:tblLook w:firstColumn="1" w:firstRow="1" w:lastColumn="0" w:lastRow="0" w:noHBand="0" w:noVBand="1" w:val="04A0"/>
-        <w:tblW w:w="9072" w:type="dxa"/>
-        <w:tblLayout w:type="fixed"/>
       </w:tblPr>
       <w:tblGrid>
         <w:gridCol w:w="6336"/>
@@ -14072,10 +14071,9 @@
     <w:tbl>
       <w:tblPr>
         <w:tblStyle w:val="Tablaconcuadrcula1clara-nfasis1"/>
+        <w:tblW w:w="9072" w:type="dxa"/>
         <w:tblLayout w:type="fixed"/>
         <w:tblLook w:firstColumn="1" w:firstRow="1" w:lastColumn="0" w:lastRow="0" w:noHBand="0" w:noVBand="1" w:val="04A0"/>
-        <w:tblW w:w="9072" w:type="dxa"/>
-        <w:tblLayout w:type="fixed"/>
       </w:tblPr>
       <w:tblGrid>
         <w:gridCol w:w="1007"/>
@@ -14579,10 +14577,9 @@
     <w:tbl>
       <w:tblPr>
         <w:tblStyle w:val="Tablaconcuadrcula1clara-nfasis1"/>
+        <w:tblW w:w="9072" w:type="dxa"/>
         <w:tblLayout w:type="fixed"/>
         <w:tblLook w:firstColumn="1" w:firstRow="1" w:lastColumn="0" w:lastRow="0" w:noHBand="0" w:noVBand="1" w:val="04A0"/>
-        <w:tblW w:w="9072" w:type="dxa"/>
-        <w:tblLayout w:type="fixed"/>
       </w:tblPr>
       <w:tblGrid>
         <w:gridCol w:w="1080"/>

</xml_diff>

<commit_message>
docs: adelantar HU-08 al Sprint 2 en el Product Backlog y la DoD
Co-Authored-By: Claude Opus 5.5 <noreply@anthropic.com>
Claude-Session: https://claude.ai/code/session_019yAiQ6SJ8faHeryAa6w9Vi
</commit_message>
<xml_diff>
--- a/Fase 2/Evidencias Proyecto (version Agil)/Documento 02- Product Backlog.docx
+++ b/Fase 2/Evidencias Proyecto (version Agil)/Documento 02- Product Backlog.docx
@@ -1326,7 +1326,7 @@
                 <w:noProof/>
                 <w:webHidden/>
               </w:rPr>
-              <w:t>5</w:t>
+              <w:t>6</w:t>
             </w:r>
             <w:r>
               <w:rPr>
@@ -2061,7 +2061,7 @@
                 <w:noProof/>
                 <w:webHidden/>
               </w:rPr>
-              <w:t>6</w:t>
+              <w:t>7</w:t>
             </w:r>
             <w:r>
               <w:rPr>
@@ -2878,7 +2878,7 @@
                 <w:noProof/>
                 <w:webHidden/>
               </w:rPr>
-              <w:t>7</w:t>
+              <w:t>8</w:t>
             </w:r>
             <w:r>
               <w:rPr>
@@ -3695,7 +3695,7 @@
                 <w:noProof/>
                 <w:webHidden/>
               </w:rPr>
-              <w:t>8</w:t>
+              <w:t>9</w:t>
             </w:r>
             <w:r>
               <w:rPr>
@@ -4430,7 +4430,7 @@
                 <w:noProof/>
                 <w:webHidden/>
               </w:rPr>
-              <w:t>9</w:t>
+              <w:t>10</w:t>
             </w:r>
             <w:r>
               <w:rPr>
@@ -5246,7 +5246,7 @@
                 <w:noProof/>
                 <w:webHidden/>
               </w:rPr>
-              <w:t>10</w:t>
+              <w:t>11</w:t>
             </w:r>
             <w:r>
               <w:rPr>
@@ -5328,7 +5328,7 @@
                 <w:noProof/>
                 <w:webHidden/>
               </w:rPr>
-              <w:t>10</w:t>
+              <w:t>11</w:t>
             </w:r>
             <w:r>
               <w:rPr>
@@ -6226,7 +6226,7 @@
                 <w:noProof/>
                 <w:webHidden/>
               </w:rPr>
-              <w:t>11</w:t>
+              <w:t>12</w:t>
             </w:r>
             <w:r>
               <w:rPr>
@@ -6308,7 +6308,7 @@
                 <w:noProof/>
                 <w:webHidden/>
               </w:rPr>
-              <w:t>11</w:t>
+              <w:t>12</w:t>
             </w:r>
             <w:r>
               <w:rPr>
@@ -7125,7 +7125,7 @@
                 <w:noProof/>
                 <w:webHidden/>
               </w:rPr>
-              <w:t>12</w:t>
+              <w:t>13</w:t>
             </w:r>
             <w:r>
               <w:rPr>
@@ -7206,7 +7206,7 @@
                 <w:noProof/>
                 <w:webHidden/>
               </w:rPr>
-              <w:t>12</w:t>
+              <w:t>13</w:t>
             </w:r>
             <w:r>
               <w:rPr>
@@ -8488,7 +8488,7 @@
         <w:jc w:val="both"/>
       </w:pPr>
       <w:r>
-        <w:t>Los actores corresponden a los cuatro roles del sistema: administrador, encargado de bodega, vendedor y jefatura. Las historias HU-01 a HU-05 son las que el equipo comprometió para el Sprint 1 en el control de avance del 8 de octubre; HU-06 y HU-07 completan las épicas E001 y E002.</w:t>
+        <w:t>Los actores corresponden a los cuatro roles del sistema: administrador, encargado de bodega, vendedor y jefatura. Las historias HU-01 a HU-05 son las que el equipo comprometió para el Sprint 1 en el control de avance del 8 de octubre; HU-06 y HU-07 completan las épicas E001 y E002. HU-08, administración de bodegas, se adelantó del Sprint 3 al Sprint 2 porque el registro de un equipo exige que exista al menos una bodega.</w:t>
       </w:r>
     </w:p>
     <w:p>
@@ -9573,7 +9573,7 @@
         <w:t>Sprint:</w:t>
       </w:r>
       <w:r>
-        <w:t xml:space="preserve"> 3.</w:t>
+        <w:t xml:space="preserve"> 2.</w:t>
       </w:r>
     </w:p>
     <w:p>
@@ -14295,7 +14295,7 @@
               <w:rPr>
                 <w:sz w:val="19"/>
               </w:rPr>
-              <w:t>HU-01 a HU-07 (21 PF)</w:t>
+              <w:t>HU-01 a HU-08 (24 PF)</w:t>
             </w:r>
           </w:p>
         </w:tc>
@@ -14309,7 +14309,7 @@
               <w:rPr>
                 <w:sz w:val="19"/>
               </w:rPr>
-              <w:t>En curso.</w:t>
+              <w:t>En curso: las ocho historias están implementadas con sus pruebas en la semana 8; falta la revisión cruzada y la integración a la rama principal.</w:t>
             </w:r>
           </w:p>
         </w:tc>
@@ -14367,7 +14367,7 @@
               <w:rPr>
                 <w:sz w:val="19"/>
               </w:rPr>
-              <w:t>HU-08 a HU-13 (21 PF)</w:t>
+              <w:t>HU-09 a HU-13 (18 PF)</w:t>
             </w:r>
           </w:p>
         </w:tc>
@@ -14909,7 +14909,7 @@
               <w:rPr>
                 <w:sz w:val="19"/>
               </w:rPr>
-              <w:t>HU-04 Registrar un equipo por número de serie</w:t>
+              <w:t>HU-08 Administrar bodegas</w:t>
             </w:r>
           </w:p>
         </w:tc>
@@ -14923,7 +14923,7 @@
               <w:rPr>
                 <w:sz w:val="19"/>
               </w:rPr>
-              <w:t>E002</w:t>
+              <w:t>E003</w:t>
             </w:r>
           </w:p>
         </w:tc>
@@ -14937,7 +14937,7 @@
               <w:rPr>
                 <w:sz w:val="19"/>
               </w:rPr>
-              <w:t>5</w:t>
+              <w:t>3</w:t>
             </w:r>
           </w:p>
         </w:tc>
@@ -14951,7 +14951,7 @@
               <w:rPr>
                 <w:sz w:val="19"/>
               </w:rPr>
-              <w:t>2 (arrastre)</w:t>
+              <w:t>2 (adelantada)</w:t>
             </w:r>
           </w:p>
         </w:tc>
@@ -14981,7 +14981,7 @@
               <w:rPr>
                 <w:sz w:val="19"/>
               </w:rPr>
-              <w:t>HU-05 Listar equipos con filtros</w:t>
+              <w:t>HU-04 Registrar un equipo por número de serie</w:t>
             </w:r>
           </w:p>
         </w:tc>
@@ -15009,7 +15009,7 @@
               <w:rPr>
                 <w:sz w:val="19"/>
               </w:rPr>
-              <w:t>3</w:t>
+              <w:t>5</w:t>
             </w:r>
           </w:p>
         </w:tc>
@@ -15053,7 +15053,7 @@
               <w:rPr>
                 <w:sz w:val="19"/>
               </w:rPr>
-              <w:t>HU-07 Ficha del equipo con su historial</w:t>
+              <w:t>HU-05 Listar equipos con filtros</w:t>
             </w:r>
           </w:p>
         </w:tc>
@@ -15081,7 +15081,7 @@
               <w:rPr>
                 <w:sz w:val="19"/>
               </w:rPr>
-              <w:t>5</w:t>
+              <w:t>3</w:t>
             </w:r>
           </w:p>
         </w:tc>
@@ -15125,7 +15125,7 @@
               <w:rPr>
                 <w:sz w:val="19"/>
               </w:rPr>
-              <w:t>HU-06 Editar y desactivar usuarios</w:t>
+              <w:t>HU-07 Ficha del equipo con su historial</w:t>
             </w:r>
           </w:p>
         </w:tc>
@@ -15139,7 +15139,7 @@
               <w:rPr>
                 <w:sz w:val="19"/>
               </w:rPr>
-              <w:t>E001</w:t>
+              <w:t>E002</w:t>
             </w:r>
           </w:p>
         </w:tc>
@@ -15153,7 +15153,7 @@
               <w:rPr>
                 <w:sz w:val="19"/>
               </w:rPr>
-              <w:t>1</w:t>
+              <w:t>5</w:t>
             </w:r>
           </w:p>
         </w:tc>
@@ -15197,7 +15197,7 @@
               <w:rPr>
                 <w:sz w:val="19"/>
               </w:rPr>
-              <w:t>HU-08 Administrar bodegas</w:t>
+              <w:t>HU-06 Editar y desactivar usuarios</w:t>
             </w:r>
           </w:p>
         </w:tc>
@@ -15211,7 +15211,7 @@
               <w:rPr>
                 <w:sz w:val="19"/>
               </w:rPr>
-              <w:t>E003</w:t>
+              <w:t>E001</w:t>
             </w:r>
           </w:p>
         </w:tc>
@@ -15225,7 +15225,7 @@
               <w:rPr>
                 <w:sz w:val="19"/>
               </w:rPr>
-              <w:t>3</w:t>
+              <w:t>1</w:t>
             </w:r>
           </w:p>
         </w:tc>
@@ -15239,7 +15239,7 @@
               <w:rPr>
                 <w:sz w:val="19"/>
               </w:rPr>
-              <w:t>3</w:t>
+              <w:t>2 (arrastre)</w:t>
             </w:r>
           </w:p>
         </w:tc>

</xml_diff>